<commit_message>
docs: documentar descarga de PDF del perfil en el manual de usuario
Se agrega la explicacion del icono de descarga (columna PDF) del listado
de Empresas, que no estaba documentado en el manual.
</commit_message>
<xml_diff>
--- a/docs/manual_usuario/Manual_Usuario_Perfil_Afiliados_v3.docx
+++ b/docs/manual_usuario/Manual_Usuario_Perfil_Afiliados_v3.docx
@@ -698,6 +698,75 @@
     </w:p>
     <w:p>
       <w:pPr>
+        <w:pStyle w:val="Heading3"/>
+        <w:spacing w:after="100" w:before="200"/>
+      </w:pPr>
+      <w:r>
+        <w:t xml:space="preserve">Descargar el perfil completo en PDF</w:t>
+      </w:r>
+    </w:p>
+    <w:p>
+      <w:pPr>
+        <w:spacing w:after="150"/>
+      </w:pPr>
+      <w:r>
+        <w:t xml:space="preserve">En el listado de "Empresas", la primera columna de cada fila muestra un ícono de descarga (⬇, etiquetado "PDF"). Al hacer clic se abre en una pestaña nueva un reporte en PDF con todo el perfil cargado de esa empresa: datos generales, sectores y servicios, contactos, cámaras, recursos en Venezuela, sistemas de gestión, presencia internacional, experiencia relevante y sostenibilidad.</w:t>
+      </w:r>
+    </w:p>
+    <w:tbl>
+      <w:tblPr>
+        <w:tblW w:type="pct" w:w="100%"/>
+        <w:tblBorders>
+          <w:top w:val="single" w:color="auto" w:sz="4"/>
+          <w:left w:val="single" w:color="auto" w:sz="4"/>
+          <w:bottom w:val="single" w:color="auto" w:sz="4"/>
+          <w:right w:val="single" w:color="auto" w:sz="4"/>
+          <w:insideH w:val="single" w:color="auto" w:sz="4"/>
+          <w:insideV w:val="single" w:color="auto" w:sz="4"/>
+        </w:tblBorders>
+      </w:tblPr>
+      <w:tblGrid>
+        <w:gridCol w:w="100"/>
+      </w:tblGrid>
+      <w:tr>
+        <w:tc>
+          <w:tcPr>
+            <w:tcBorders>
+              <w:top w:val="none"/>
+              <w:left w:val="single" w:color="5C8A4A" w:sz="24"/>
+              <w:bottom w:val="none"/>
+              <w:right w:val="none"/>
+            </w:tcBorders>
+            <w:shd w:fill="EAF3E8" w:val="clear"/>
+            <w:tcMar>
+              <w:top w:type="dxa" w:w="150"/>
+              <w:left w:type="dxa" w:w="200"/>
+              <w:bottom w:type="dxa" w:w="150"/>
+              <w:right w:type="dxa" w:w="200"/>
+            </w:tcMar>
+          </w:tcPr>
+          <w:p>
+            <w:r>
+              <w:rPr>
+                <w:b/>
+                <w:bCs/>
+              </w:rPr>
+              <w:t xml:space="preserve">CONSEJO:  </w:t>
+            </w:r>
+            <w:r>
+              <w:t xml:space="preserve">Es la forma más rápida de revisar o compartir de un vistazo todo lo que su empresa tiene cargado en el sistema, sin tener que entrar pestaña por pestaña.</w:t>
+            </w:r>
+          </w:p>
+        </w:tc>
+      </w:tr>
+    </w:tbl>
+    <w:p>
+      <w:pPr>
+        <w:spacing w:after="200"/>
+      </w:pPr>
+    </w:p>
+    <w:p>
+      <w:pPr>
         <w:spacing w:after="150"/>
       </w:pPr>
       <w:r>
@@ -900,7 +969,7 @@
           <w:sz w:val="18"/>
           <w:szCs w:val="18"/>
         </w:rPr>
-        <w:t xml:space="preserve">Listado de Empresas</w:t>
+        <w:t xml:space="preserve">Listado de Empresas — la primera columna (ícono ⬇) es el acceso al PDF del perfil completo, descrito arriba.</w:t>
       </w:r>
     </w:p>
     <w:p>

</xml_diff>